<commit_message>
Added Updated all files
</commit_message>
<xml_diff>
--- a/docs/Day-19.docx
+++ b/docs/Day-19.docx
@@ -307,34 +307,42 @@
         <w:t>3. Cleaning Log</w:t>
       </w:r>
     </w:p>
+    <w:p/>
     <w:tbl>
       <w:tblPr>
         <w:tblStyle w:val="TableGrid"/>
-        <w:tblW w:w="0" w:type="auto"/>
+        <w:tblW w:w="8987" w:type="dxa"/>
         <w:tblLook w:val="04A0" w:firstRow="1" w:lastRow="0" w:firstColumn="1" w:lastColumn="0" w:noHBand="0" w:noVBand="1"/>
       </w:tblPr>
       <w:tblGrid>
-        <w:gridCol w:w="4292"/>
-        <w:gridCol w:w="4338"/>
+        <w:gridCol w:w="1844"/>
+        <w:gridCol w:w="2322"/>
+        <w:gridCol w:w="2365"/>
+        <w:gridCol w:w="2456"/>
       </w:tblGrid>
       <w:tr>
+        <w:trPr>
+          <w:trHeight w:val="443"/>
+        </w:trPr>
         <w:tc>
           <w:tcPr>
-            <w:tcW w:w="4428" w:type="dxa"/>
+            <w:tcW w:w="1844" w:type="dxa"/>
           </w:tcPr>
           <w:p>
             <w:pPr>
               <w:rPr>
-                <w:rFonts w:ascii="Times New Roman" w:hAnsi="Times New Roman" w:cs="Times New Roman"/>
                 <w:b/>
                 <w:bCs/>
+                <w:sz w:val="20"/>
+                <w:szCs w:val="20"/>
               </w:rPr>
             </w:pPr>
             <w:r>
               <w:rPr>
-                <w:rFonts w:ascii="Times New Roman" w:hAnsi="Times New Roman" w:cs="Times New Roman"/>
                 <w:b/>
                 <w:bCs/>
+                <w:sz w:val="20"/>
+                <w:szCs w:val="20"/>
               </w:rPr>
               <w:t>Step</w:t>
             </w:r>
@@ -342,270 +350,684 @@
         </w:tc>
         <w:tc>
           <w:tcPr>
-            <w:tcW w:w="4428" w:type="dxa"/>
+            <w:tcW w:w="2322" w:type="dxa"/>
           </w:tcPr>
           <w:p>
             <w:pPr>
               <w:rPr>
-                <w:rFonts w:ascii="Times New Roman" w:hAnsi="Times New Roman" w:cs="Times New Roman"/>
                 <w:b/>
                 <w:bCs/>
+                <w:sz w:val="20"/>
+                <w:szCs w:val="20"/>
               </w:rPr>
             </w:pPr>
             <w:r>
               <w:rPr>
-                <w:rFonts w:ascii="Times New Roman" w:hAnsi="Times New Roman" w:cs="Times New Roman"/>
                 <w:b/>
                 <w:bCs/>
+                <w:sz w:val="20"/>
+                <w:szCs w:val="20"/>
               </w:rPr>
-              <w:t>Details</w:t>
+              <w:t>Before (Raw - project_dataset.csv)</w:t>
+            </w:r>
+          </w:p>
+        </w:tc>
+        <w:tc>
+          <w:tcPr>
+            <w:tcW w:w="2365" w:type="dxa"/>
+          </w:tcPr>
+          <w:p>
+            <w:pPr>
+              <w:rPr>
+                <w:b/>
+                <w:bCs/>
+                <w:sz w:val="20"/>
+                <w:szCs w:val="20"/>
+              </w:rPr>
+            </w:pPr>
+            <w:r>
+              <w:rPr>
+                <w:b/>
+                <w:bCs/>
+                <w:sz w:val="20"/>
+                <w:szCs w:val="20"/>
+              </w:rPr>
+              <w:t>After (Clean - cleaned_movies.csv)</w:t>
+            </w:r>
+          </w:p>
+        </w:tc>
+        <w:tc>
+          <w:tcPr>
+            <w:tcW w:w="2456" w:type="dxa"/>
+          </w:tcPr>
+          <w:p>
+            <w:pPr>
+              <w:rPr>
+                <w:b/>
+                <w:bCs/>
+                <w:sz w:val="20"/>
+                <w:szCs w:val="20"/>
+              </w:rPr>
+            </w:pPr>
+            <w:r>
+              <w:rPr>
+                <w:b/>
+                <w:bCs/>
+                <w:sz w:val="20"/>
+                <w:szCs w:val="20"/>
+              </w:rPr>
+              <w:t>Action Taken</w:t>
             </w:r>
           </w:p>
         </w:tc>
       </w:tr>
       <w:tr>
+        <w:trPr>
+          <w:trHeight w:val="443"/>
+        </w:trPr>
         <w:tc>
           <w:tcPr>
-            <w:tcW w:w="4428" w:type="dxa"/>
+            <w:tcW w:w="1844" w:type="dxa"/>
           </w:tcPr>
           <w:p>
             <w:pPr>
               <w:rPr>
-                <w:rFonts w:ascii="Times New Roman" w:hAnsi="Times New Roman" w:cs="Times New Roman"/>
+                <w:sz w:val="20"/>
+                <w:szCs w:val="20"/>
               </w:rPr>
             </w:pPr>
             <w:r>
               <w:rPr>
-                <w:rFonts w:ascii="Times New Roman" w:hAnsi="Times New Roman" w:cs="Times New Roman"/>
+                <w:sz w:val="20"/>
+                <w:szCs w:val="20"/>
               </w:rPr>
-              <w:t>Initial row count</w:t>
+              <w:t>Row count</w:t>
             </w:r>
           </w:p>
         </w:tc>
         <w:tc>
           <w:tcPr>
-            <w:tcW w:w="4428" w:type="dxa"/>
+            <w:tcW w:w="2322" w:type="dxa"/>
           </w:tcPr>
           <w:p>
             <w:pPr>
               <w:rPr>
-                <w:rFonts w:ascii="Times New Roman" w:hAnsi="Times New Roman" w:cs="Times New Roman"/>
+                <w:sz w:val="20"/>
+                <w:szCs w:val="20"/>
               </w:rPr>
             </w:pPr>
             <w:r>
               <w:rPr>
-                <w:rFonts w:ascii="Times New Roman" w:hAnsi="Times New Roman" w:cs="Times New Roman"/>
+                <w:sz w:val="20"/>
+                <w:szCs w:val="20"/>
               </w:rPr>
               <w:t>4803</w:t>
             </w:r>
           </w:p>
         </w:tc>
-      </w:tr>
-      <w:tr>
         <w:tc>
           <w:tcPr>
-            <w:tcW w:w="4428" w:type="dxa"/>
+            <w:tcW w:w="2365" w:type="dxa"/>
           </w:tcPr>
           <w:p>
             <w:pPr>
               <w:rPr>
-                <w:rFonts w:ascii="Times New Roman" w:hAnsi="Times New Roman" w:cs="Times New Roman"/>
+                <w:sz w:val="20"/>
+                <w:szCs w:val="20"/>
               </w:rPr>
             </w:pPr>
             <w:r>
               <w:rPr>
-                <w:rFonts w:ascii="Times New Roman" w:hAnsi="Times New Roman" w:cs="Times New Roman"/>
+                <w:sz w:val="20"/>
+                <w:szCs w:val="20"/>
               </w:rPr>
-              <w:t>Duplicate rows removed</w:t>
+              <w:t>4803</w:t>
             </w:r>
           </w:p>
         </w:tc>
         <w:tc>
           <w:tcPr>
-            <w:tcW w:w="4428" w:type="dxa"/>
+            <w:tcW w:w="2456" w:type="dxa"/>
           </w:tcPr>
           <w:p>
             <w:pPr>
               <w:rPr>
-                <w:rFonts w:ascii="Times New Roman" w:hAnsi="Times New Roman" w:cs="Times New Roman"/>
+                <w:sz w:val="20"/>
+                <w:szCs w:val="20"/>
               </w:rPr>
             </w:pPr>
             <w:r>
               <w:rPr>
-                <w:rFonts w:ascii="Times New Roman" w:hAnsi="Times New Roman" w:cs="Times New Roman"/>
+                <w:sz w:val="20"/>
+                <w:szCs w:val="20"/>
               </w:rPr>
-              <w:t>0</w:t>
+              <w:t>No rows removed during cleaning</w:t>
             </w:r>
           </w:p>
         </w:tc>
       </w:tr>
       <w:tr>
+        <w:trPr>
+          <w:trHeight w:val="433"/>
+        </w:trPr>
         <w:tc>
           <w:tcPr>
-            <w:tcW w:w="4428" w:type="dxa"/>
+            <w:tcW w:w="1844" w:type="dxa"/>
           </w:tcPr>
           <w:p>
             <w:pPr>
               <w:rPr>
-                <w:rFonts w:ascii="Times New Roman" w:hAnsi="Times New Roman" w:cs="Times New Roman"/>
+                <w:sz w:val="20"/>
+                <w:szCs w:val="20"/>
               </w:rPr>
             </w:pPr>
             <w:r>
               <w:rPr>
-                <w:rFonts w:ascii="Times New Roman" w:hAnsi="Times New Roman" w:cs="Times New Roman"/>
+                <w:sz w:val="20"/>
+                <w:szCs w:val="20"/>
               </w:rPr>
-              <w:t>Missing budget values</w:t>
+              <w:t>Column count</w:t>
             </w:r>
           </w:p>
         </w:tc>
         <w:tc>
           <w:tcPr>
-            <w:tcW w:w="4428" w:type="dxa"/>
+            <w:tcW w:w="2322" w:type="dxa"/>
           </w:tcPr>
           <w:p>
             <w:pPr>
               <w:rPr>
-                <w:rFonts w:ascii="Times New Roman" w:hAnsi="Times New Roman" w:cs="Times New Roman"/>
+                <w:sz w:val="20"/>
+                <w:szCs w:val="20"/>
               </w:rPr>
             </w:pPr>
             <w:r>
               <w:rPr>
-                <w:rFonts w:ascii="Times New Roman" w:hAnsi="Times New Roman" w:cs="Times New Roman"/>
+                <w:sz w:val="20"/>
+                <w:szCs w:val="20"/>
               </w:rPr>
-              <w:t>Replaced with 0</w:t>
+              <w:t>51</w:t>
+            </w:r>
+          </w:p>
+        </w:tc>
+        <w:tc>
+          <w:tcPr>
+            <w:tcW w:w="2365" w:type="dxa"/>
+          </w:tcPr>
+          <w:p>
+            <w:pPr>
+              <w:rPr>
+                <w:sz w:val="20"/>
+                <w:szCs w:val="20"/>
+              </w:rPr>
+            </w:pPr>
+            <w:r>
+              <w:rPr>
+                <w:sz w:val="20"/>
+                <w:szCs w:val="20"/>
+              </w:rPr>
+              <w:t>51</w:t>
+            </w:r>
+          </w:p>
+        </w:tc>
+        <w:tc>
+          <w:tcPr>
+            <w:tcW w:w="2456" w:type="dxa"/>
+          </w:tcPr>
+          <w:p>
+            <w:pPr>
+              <w:rPr>
+                <w:sz w:val="20"/>
+                <w:szCs w:val="20"/>
+              </w:rPr>
+            </w:pPr>
+            <w:r>
+              <w:rPr>
+                <w:sz w:val="20"/>
+                <w:szCs w:val="20"/>
+              </w:rPr>
+              <w:t>Dataset structure maintained</w:t>
             </w:r>
           </w:p>
         </w:tc>
       </w:tr>
       <w:tr>
+        <w:trPr>
+          <w:trHeight w:val="671"/>
+        </w:trPr>
         <w:tc>
           <w:tcPr>
-            <w:tcW w:w="4428" w:type="dxa"/>
+            <w:tcW w:w="1844" w:type="dxa"/>
           </w:tcPr>
           <w:p>
             <w:pPr>
               <w:rPr>
-                <w:rFonts w:ascii="Times New Roman" w:hAnsi="Times New Roman" w:cs="Times New Roman"/>
+                <w:sz w:val="20"/>
+                <w:szCs w:val="20"/>
               </w:rPr>
             </w:pPr>
             <w:r>
               <w:rPr>
-                <w:rFonts w:ascii="Times New Roman" w:hAnsi="Times New Roman" w:cs="Times New Roman"/>
+                <w:sz w:val="20"/>
+                <w:szCs w:val="20"/>
               </w:rPr>
-              <w:t>Missing revenue values</w:t>
+              <w:t>Duplicate records</w:t>
             </w:r>
           </w:p>
         </w:tc>
         <w:tc>
           <w:tcPr>
-            <w:tcW w:w="4428" w:type="dxa"/>
+            <w:tcW w:w="2322" w:type="dxa"/>
           </w:tcPr>
           <w:p>
             <w:pPr>
               <w:rPr>
-                <w:rFonts w:ascii="Times New Roman" w:hAnsi="Times New Roman" w:cs="Times New Roman"/>
+                <w:sz w:val="20"/>
+                <w:szCs w:val="20"/>
               </w:rPr>
             </w:pPr>
             <w:r>
               <w:rPr>
-                <w:rFonts w:ascii="Times New Roman" w:hAnsi="Times New Roman" w:cs="Times New Roman"/>
+                <w:sz w:val="20"/>
+                <w:szCs w:val="20"/>
               </w:rPr>
-              <w:t>Handled appropriately</w:t>
+              <w:t>Checked</w:t>
+            </w:r>
+          </w:p>
+        </w:tc>
+        <w:tc>
+          <w:tcPr>
+            <w:tcW w:w="2365" w:type="dxa"/>
+          </w:tcPr>
+          <w:p>
+            <w:pPr>
+              <w:rPr>
+                <w:sz w:val="20"/>
+                <w:szCs w:val="20"/>
+              </w:rPr>
+            </w:pPr>
+            <w:r>
+              <w:rPr>
+                <w:sz w:val="20"/>
+                <w:szCs w:val="20"/>
+              </w:rPr>
+              <w:t>0 duplicates</w:t>
+            </w:r>
+          </w:p>
+        </w:tc>
+        <w:tc>
+          <w:tcPr>
+            <w:tcW w:w="2456" w:type="dxa"/>
+          </w:tcPr>
+          <w:p>
+            <w:pPr>
+              <w:rPr>
+                <w:sz w:val="20"/>
+                <w:szCs w:val="20"/>
+              </w:rPr>
+            </w:pPr>
+            <w:r>
+              <w:rPr>
+                <w:sz w:val="20"/>
+                <w:szCs w:val="20"/>
+              </w:rPr>
+              <w:t>Verified dataset contained no duplicate rows</w:t>
             </w:r>
           </w:p>
         </w:tc>
       </w:tr>
       <w:tr>
+        <w:trPr>
+          <w:trHeight w:val="660"/>
+        </w:trPr>
         <w:tc>
           <w:tcPr>
-            <w:tcW w:w="4428" w:type="dxa"/>
+            <w:tcW w:w="1844" w:type="dxa"/>
           </w:tcPr>
           <w:p>
             <w:pPr>
               <w:rPr>
-                <w:rFonts w:ascii="Times New Roman" w:hAnsi="Times New Roman" w:cs="Times New Roman"/>
+                <w:sz w:val="20"/>
+                <w:szCs w:val="20"/>
               </w:rPr>
             </w:pPr>
             <w:r>
               <w:rPr>
-                <w:rFonts w:ascii="Times New Roman" w:hAnsi="Times New Roman" w:cs="Times New Roman"/>
+                <w:sz w:val="20"/>
+                <w:szCs w:val="20"/>
               </w:rPr>
-              <w:t>Date conversion</w:t>
+              <w:t>Missing values</w:t>
             </w:r>
           </w:p>
         </w:tc>
         <w:tc>
           <w:tcPr>
-            <w:tcW w:w="4428" w:type="dxa"/>
+            <w:tcW w:w="2322" w:type="dxa"/>
           </w:tcPr>
           <w:p>
             <w:pPr>
               <w:rPr>
-                <w:rFonts w:ascii="Times New Roman" w:hAnsi="Times New Roman" w:cs="Times New Roman"/>
+                <w:sz w:val="20"/>
+                <w:szCs w:val="20"/>
               </w:rPr>
             </w:pPr>
             <w:r>
               <w:rPr>
-                <w:rFonts w:ascii="Times New Roman" w:hAnsi="Times New Roman" w:cs="Times New Roman"/>
+                <w:sz w:val="20"/>
+                <w:szCs w:val="20"/>
               </w:rPr>
-              <w:t xml:space="preserve">Converted </w:t>
+              <w:t>Present in some fields</w:t>
             </w:r>
+          </w:p>
+        </w:tc>
+        <w:tc>
+          <w:tcPr>
+            <w:tcW w:w="2365" w:type="dxa"/>
+          </w:tcPr>
+          <w:p>
+            <w:pPr>
+              <w:rPr>
+                <w:sz w:val="20"/>
+                <w:szCs w:val="20"/>
+              </w:rPr>
+            </w:pPr>
+            <w:r>
+              <w:rPr>
+                <w:sz w:val="20"/>
+                <w:szCs w:val="20"/>
+              </w:rPr>
+              <w:t>Handled</w:t>
+            </w:r>
+          </w:p>
+        </w:tc>
+        <w:tc>
+          <w:tcPr>
+            <w:tcW w:w="2456" w:type="dxa"/>
+          </w:tcPr>
+          <w:p>
+            <w:pPr>
+              <w:rPr>
+                <w:sz w:val="20"/>
+                <w:szCs w:val="20"/>
+              </w:rPr>
+            </w:pPr>
+            <w:r>
+              <w:rPr>
+                <w:sz w:val="20"/>
+                <w:szCs w:val="20"/>
+              </w:rPr>
+              <w:t>Missing values cleaned or replaced where required</w:t>
+            </w:r>
+          </w:p>
+        </w:tc>
+      </w:tr>
+      <w:tr>
+        <w:trPr>
+          <w:trHeight w:val="887"/>
+        </w:trPr>
+        <w:tc>
+          <w:tcPr>
+            <w:tcW w:w="1844" w:type="dxa"/>
+          </w:tcPr>
+          <w:p>
+            <w:pPr>
+              <w:rPr>
+                <w:sz w:val="20"/>
+                <w:szCs w:val="20"/>
+              </w:rPr>
+            </w:pPr>
             <w:proofErr w:type="spellStart"/>
             <w:r>
               <w:rPr>
-                <w:rFonts w:ascii="Times New Roman" w:hAnsi="Times New Roman" w:cs="Times New Roman"/>
+                <w:sz w:val="20"/>
+                <w:szCs w:val="20"/>
               </w:rPr>
               <w:t>Release_Date</w:t>
             </w:r>
             <w:proofErr w:type="spellEnd"/>
             <w:r>
               <w:rPr>
-                <w:rFonts w:ascii="Times New Roman" w:hAnsi="Times New Roman" w:cs="Times New Roman"/>
+                <w:sz w:val="20"/>
+                <w:szCs w:val="20"/>
               </w:rPr>
-              <w:t xml:space="preserve"> to datetime</w:t>
+              <w:t xml:space="preserve"> format</w:t>
+            </w:r>
+          </w:p>
+        </w:tc>
+        <w:tc>
+          <w:tcPr>
+            <w:tcW w:w="2322" w:type="dxa"/>
+          </w:tcPr>
+          <w:p>
+            <w:pPr>
+              <w:rPr>
+                <w:sz w:val="20"/>
+                <w:szCs w:val="20"/>
+              </w:rPr>
+            </w:pPr>
+            <w:r>
+              <w:rPr>
+                <w:sz w:val="20"/>
+                <w:szCs w:val="20"/>
+              </w:rPr>
+              <w:t>DD-MM-YYYY 00:00</w:t>
+            </w:r>
+          </w:p>
+        </w:tc>
+        <w:tc>
+          <w:tcPr>
+            <w:tcW w:w="2365" w:type="dxa"/>
+          </w:tcPr>
+          <w:p>
+            <w:pPr>
+              <w:rPr>
+                <w:sz w:val="20"/>
+                <w:szCs w:val="20"/>
+              </w:rPr>
+            </w:pPr>
+            <w:r>
+              <w:rPr>
+                <w:sz w:val="20"/>
+                <w:szCs w:val="20"/>
+              </w:rPr>
+              <w:t>DD-MM-YYYY</w:t>
+            </w:r>
+          </w:p>
+        </w:tc>
+        <w:tc>
+          <w:tcPr>
+            <w:tcW w:w="2456" w:type="dxa"/>
+          </w:tcPr>
+          <w:p>
+            <w:pPr>
+              <w:rPr>
+                <w:sz w:val="20"/>
+                <w:szCs w:val="20"/>
+              </w:rPr>
+            </w:pPr>
+            <w:r>
+              <w:rPr>
+                <w:sz w:val="20"/>
+                <w:szCs w:val="20"/>
+              </w:rPr>
+              <w:t>Removed unnecessary time portion and standardized date format</w:t>
             </w:r>
           </w:p>
         </w:tc>
       </w:tr>
       <w:tr>
+        <w:trPr>
+          <w:trHeight w:val="443"/>
+        </w:trPr>
         <w:tc>
           <w:tcPr>
-            <w:tcW w:w="4428" w:type="dxa"/>
+            <w:tcW w:w="1844" w:type="dxa"/>
           </w:tcPr>
           <w:p>
             <w:pPr>
               <w:rPr>
-                <w:rFonts w:ascii="Times New Roman" w:hAnsi="Times New Roman" w:cs="Times New Roman"/>
+                <w:sz w:val="20"/>
+                <w:szCs w:val="20"/>
               </w:rPr>
             </w:pPr>
             <w:r>
               <w:rPr>
-                <w:rFonts w:ascii="Times New Roman" w:hAnsi="Times New Roman" w:cs="Times New Roman"/>
+                <w:sz w:val="20"/>
+                <w:szCs w:val="20"/>
               </w:rPr>
+              <w:t>Text fields</w:t>
+            </w:r>
+          </w:p>
+        </w:tc>
+        <w:tc>
+          <w:tcPr>
+            <w:tcW w:w="2322" w:type="dxa"/>
+          </w:tcPr>
+          <w:p>
+            <w:pPr>
+              <w:rPr>
+                <w:sz w:val="20"/>
+                <w:szCs w:val="20"/>
+              </w:rPr>
+            </w:pPr>
+            <w:r>
+              <w:rPr>
+                <w:sz w:val="20"/>
+                <w:szCs w:val="20"/>
+              </w:rPr>
+              <w:t>Minor inconsistencies</w:t>
+            </w:r>
+          </w:p>
+        </w:tc>
+        <w:tc>
+          <w:tcPr>
+            <w:tcW w:w="2365" w:type="dxa"/>
+          </w:tcPr>
+          <w:p>
+            <w:pPr>
+              <w:rPr>
+                <w:sz w:val="20"/>
+                <w:szCs w:val="20"/>
+              </w:rPr>
+            </w:pPr>
+            <w:r>
+              <w:rPr>
+                <w:sz w:val="20"/>
+                <w:szCs w:val="20"/>
+              </w:rPr>
+              <w:t>Standardized</w:t>
+            </w:r>
+          </w:p>
+        </w:tc>
+        <w:tc>
+          <w:tcPr>
+            <w:tcW w:w="2456" w:type="dxa"/>
+          </w:tcPr>
+          <w:p>
+            <w:pPr>
+              <w:rPr>
+                <w:sz w:val="20"/>
+                <w:szCs w:val="20"/>
+              </w:rPr>
+            </w:pPr>
+            <w:r>
+              <w:rPr>
+                <w:sz w:val="20"/>
+                <w:szCs w:val="20"/>
+              </w:rPr>
+              <w:t>Cleaned text formatting in title, director, production company, and cast-related columns</w:t>
+            </w:r>
+          </w:p>
+        </w:tc>
+      </w:tr>
+      <w:tr>
+        <w:trPr>
+          <w:trHeight w:val="123"/>
+        </w:trPr>
+        <w:tc>
+          <w:tcPr>
+            <w:tcW w:w="1844" w:type="dxa"/>
+          </w:tcPr>
+          <w:p>
+            <w:pPr>
+              <w:rPr>
+                <w:sz w:val="20"/>
+                <w:szCs w:val="20"/>
+              </w:rPr>
+            </w:pPr>
+            <w:r>
+              <w:rPr>
+                <w:sz w:val="20"/>
+                <w:szCs w:val="20"/>
+              </w:rPr>
+              <w:lastRenderedPageBreak/>
               <w:t>Feature engineering</w:t>
             </w:r>
           </w:p>
         </w:tc>
         <w:tc>
           <w:tcPr>
-            <w:tcW w:w="4428" w:type="dxa"/>
+            <w:tcW w:w="2322" w:type="dxa"/>
           </w:tcPr>
           <w:p>
             <w:pPr>
               <w:rPr>
-                <w:rFonts w:ascii="Times New Roman" w:hAnsi="Times New Roman" w:cs="Times New Roman"/>
+                <w:sz w:val="20"/>
+                <w:szCs w:val="20"/>
               </w:rPr>
             </w:pPr>
             <w:r>
               <w:rPr>
-                <w:rFonts w:ascii="Times New Roman" w:hAnsi="Times New Roman" w:cs="Times New Roman"/>
+                <w:sz w:val="20"/>
+                <w:szCs w:val="20"/>
               </w:rPr>
-              <w:t xml:space="preserve">Created Profit, ROI, and </w:t>
+              <w:t>Available but unvalidated</w:t>
+            </w:r>
+          </w:p>
+        </w:tc>
+        <w:tc>
+          <w:tcPr>
+            <w:tcW w:w="2365" w:type="dxa"/>
+          </w:tcPr>
+          <w:p>
+            <w:pPr>
+              <w:rPr>
+                <w:sz w:val="20"/>
+                <w:szCs w:val="20"/>
+              </w:rPr>
+            </w:pPr>
+            <w:r>
+              <w:rPr>
+                <w:sz w:val="20"/>
+                <w:szCs w:val="20"/>
+              </w:rPr>
+              <w:t>Validated and retained</w:t>
+            </w:r>
+          </w:p>
+        </w:tc>
+        <w:tc>
+          <w:tcPr>
+            <w:tcW w:w="2456" w:type="dxa"/>
+          </w:tcPr>
+          <w:p>
+            <w:pPr>
+              <w:rPr>
+                <w:sz w:val="20"/>
+                <w:szCs w:val="20"/>
+              </w:rPr>
+            </w:pPr>
+            <w:r>
+              <w:rPr>
+                <w:sz w:val="20"/>
+                <w:szCs w:val="20"/>
+              </w:rPr>
+              <w:t xml:space="preserve">Verified calculated fields such as Profit, ROI, and </w:t>
             </w:r>
             <w:proofErr w:type="spellStart"/>
             <w:r>
               <w:rPr>
-                <w:rFonts w:ascii="Times New Roman" w:hAnsi="Times New Roman" w:cs="Times New Roman"/>
+                <w:sz w:val="20"/>
+                <w:szCs w:val="20"/>
               </w:rPr>
               <w:t>Revenue_Budget_Ratio</w:t>
             </w:r>
@@ -614,108 +1036,95 @@
         </w:tc>
       </w:tr>
       <w:tr>
+        <w:trPr>
+          <w:trHeight w:val="887"/>
+        </w:trPr>
         <w:tc>
           <w:tcPr>
-            <w:tcW w:w="4428" w:type="dxa"/>
+            <w:tcW w:w="1844" w:type="dxa"/>
           </w:tcPr>
           <w:p>
             <w:pPr>
               <w:rPr>
-                <w:rFonts w:ascii="Times New Roman" w:hAnsi="Times New Roman" w:cs="Times New Roman"/>
+                <w:sz w:val="20"/>
+                <w:szCs w:val="20"/>
               </w:rPr>
             </w:pPr>
             <w:r>
               <w:rPr>
-                <w:rFonts w:ascii="Times New Roman" w:hAnsi="Times New Roman" w:cs="Times New Roman"/>
+                <w:sz w:val="20"/>
+                <w:szCs w:val="20"/>
               </w:rPr>
-              <w:t>New columns created</w:t>
+              <w:t>Data quality</w:t>
             </w:r>
           </w:p>
         </w:tc>
         <w:tc>
           <w:tcPr>
-            <w:tcW w:w="4428" w:type="dxa"/>
+            <w:tcW w:w="2322" w:type="dxa"/>
           </w:tcPr>
           <w:p>
             <w:pPr>
               <w:rPr>
-                <w:rFonts w:ascii="Times New Roman" w:hAnsi="Times New Roman" w:cs="Times New Roman"/>
-              </w:rPr>
-            </w:pPr>
-            <w:proofErr w:type="spellStart"/>
-            <w:r>
-              <w:rPr>
-                <w:rFonts w:ascii="Times New Roman" w:hAnsi="Times New Roman" w:cs="Times New Roman"/>
-              </w:rPr>
-              <w:t>Release_Year</w:t>
-            </w:r>
-            <w:proofErr w:type="spellEnd"/>
-            <w:r>
-              <w:rPr>
-                <w:rFonts w:ascii="Times New Roman" w:hAnsi="Times New Roman" w:cs="Times New Roman"/>
-              </w:rPr>
-              <w:t xml:space="preserve">, </w:t>
-            </w:r>
-            <w:proofErr w:type="spellStart"/>
-            <w:r>
-              <w:rPr>
-                <w:rFonts w:ascii="Times New Roman" w:hAnsi="Times New Roman" w:cs="Times New Roman"/>
-              </w:rPr>
-              <w:t>Release_Season</w:t>
-            </w:r>
-            <w:proofErr w:type="spellEnd"/>
-            <w:r>
-              <w:rPr>
-                <w:rFonts w:ascii="Times New Roman" w:hAnsi="Times New Roman" w:cs="Times New Roman"/>
-              </w:rPr>
-              <w:t xml:space="preserve">, </w:t>
-            </w:r>
-            <w:proofErr w:type="spellStart"/>
-            <w:r>
-              <w:rPr>
-                <w:rFonts w:ascii="Times New Roman" w:hAnsi="Times New Roman" w:cs="Times New Roman"/>
-              </w:rPr>
-              <w:t>Budget_Category</w:t>
-            </w:r>
-            <w:proofErr w:type="spellEnd"/>
-          </w:p>
-        </w:tc>
-      </w:tr>
-      <w:tr>
-        <w:tc>
-          <w:tcPr>
-            <w:tcW w:w="4428" w:type="dxa"/>
-          </w:tcPr>
-          <w:p>
-            <w:pPr>
-              <w:rPr>
-                <w:rFonts w:ascii="Times New Roman" w:hAnsi="Times New Roman" w:cs="Times New Roman"/>
+                <w:sz w:val="20"/>
+                <w:szCs w:val="20"/>
               </w:rPr>
             </w:pPr>
             <w:r>
               <w:rPr>
-                <w:rFonts w:ascii="Times New Roman" w:hAnsi="Times New Roman" w:cs="Times New Roman"/>
+                <w:sz w:val="20"/>
+                <w:szCs w:val="20"/>
               </w:rPr>
-              <w:t>Final row count</w:t>
+              <w:t>Raw dataset</w:t>
             </w:r>
           </w:p>
         </w:tc>
         <w:tc>
           <w:tcPr>
-            <w:tcW w:w="4428" w:type="dxa"/>
+            <w:tcW w:w="2365" w:type="dxa"/>
           </w:tcPr>
           <w:p>
             <w:pPr>
               <w:rPr>
-                <w:rFonts w:ascii="Times New Roman" w:hAnsi="Times New Roman" w:cs="Times New Roman"/>
+                <w:sz w:val="20"/>
+                <w:szCs w:val="20"/>
               </w:rPr>
             </w:pPr>
             <w:r>
               <w:rPr>
-                <w:rFonts w:ascii="Times New Roman" w:hAnsi="Times New Roman" w:cs="Times New Roman"/>
+                <w:sz w:val="20"/>
+                <w:szCs w:val="20"/>
               </w:rPr>
-              <w:t>4803</w:t>
+              <w:t>Analysis-ready dataset</w:t>
             </w:r>
+          </w:p>
+        </w:tc>
+        <w:tc>
+          <w:tcPr>
+            <w:tcW w:w="2456" w:type="dxa"/>
+          </w:tcPr>
+          <w:p>
+            <w:pPr>
+              <w:rPr>
+                <w:sz w:val="20"/>
+                <w:szCs w:val="20"/>
+              </w:rPr>
+            </w:pPr>
+            <w:r>
+              <w:rPr>
+                <w:sz w:val="20"/>
+                <w:szCs w:val="20"/>
+              </w:rPr>
+              <w:t>Final validation completed for Power BI and SQL analysis</w:t>
+            </w:r>
+          </w:p>
+          <w:p>
+            <w:pPr>
+              <w:rPr>
+                <w:sz w:val="20"/>
+                <w:szCs w:val="20"/>
+              </w:rPr>
+            </w:pPr>
           </w:p>
         </w:tc>
       </w:tr>
@@ -1858,6 +2267,7 @@
   <w:style w:type="character" w:default="1" w:styleId="DefaultParagraphFont">
     <w:name w:val="Default Paragraph Font"/>
     <w:uiPriority w:val="1"/>
+    <w:semiHidden/>
     <w:unhideWhenUsed/>
   </w:style>
   <w:style w:type="table" w:default="1" w:styleId="TableNormal">
@@ -12633,6 +13043,19 @@
         <w:shd w:val="clear" w:color="auto" w:fill="FBCAA2" w:themeFill="accent6" w:themeFillTint="7F"/>
       </w:tcPr>
     </w:tblStylePr>
+  </w:style>
+  <w:style w:type="character" w:styleId="HTMLCode">
+    <w:name w:val="HTML Code"/>
+    <w:basedOn w:val="DefaultParagraphFont"/>
+    <w:uiPriority w:val="99"/>
+    <w:semiHidden/>
+    <w:unhideWhenUsed/>
+    <w:rsid w:val="00452792"/>
+    <w:rPr>
+      <w:rFonts w:ascii="Courier New" w:eastAsia="Times New Roman" w:hAnsi="Courier New" w:cs="Courier New"/>
+      <w:sz w:val="20"/>
+      <w:szCs w:val="20"/>
+    </w:rPr>
   </w:style>
 </w:styles>
 </file>

</xml_diff>